<commit_message>
Drop phone from registration
The form stopped asking for it when it was rebuilt to match the design, but
the endpoint still accepted it, so the two disagreed about what registration
collects.

Removed from validation rather than rejected, as with the other dropped
fields: a client still sending a phone registers successfully and the key is
discarded, so an older build keeps working instead of failing at 422.

The column and the account screen are untouched — a reader who wants to leave
a number can still add one afterwards, and it is the only way to reach someone
off the platform.

Co-Authored-By: Claude Opus 5 <noreply@anthropic.com>
</commit_message>
<xml_diff>
--- a/docs/Himam-Auth-APIs.docx
+++ b/docs/Himam-Auth-APIs.docx
@@ -1258,83 +1258,6 @@
                 <w:sz w:val="18"/>
                 <w:szCs w:val="18"/>
               </w:rPr>
-              <w:t xml:space="preserve">phone</w:t>
-            </w:r>
-          </w:p>
-        </w:tc>
-        <w:tc>
-          <w:tcPr>
-            <w:tcW w:type="dxa" w:w="1000"/>
-            <w:tcMar>
-              <w:top w:type="dxa" w:w="90"/>
-              <w:left w:type="dxa" w:w="130"/>
-              <w:bottom w:type="dxa" w:w="90"/>
-              <w:right w:type="dxa" w:w="130"/>
-            </w:tcMar>
-          </w:tcPr>
-          <w:p>
-            <w:pPr>
-              <w:spacing w:after="0" w:line="260"/>
-            </w:pPr>
-            <w:r>
-              <w:rPr>
-                <w:rFonts w:ascii="Calibri" w:cs="Calibri" w:eastAsia="Calibri" w:hAnsi="Calibri"/>
-                <w:color w:val="1A1F1C"/>
-                <w:sz w:val="19"/>
-                <w:szCs w:val="19"/>
-              </w:rPr>
-              <w:t xml:space="preserve">no</w:t>
-            </w:r>
-          </w:p>
-        </w:tc>
-        <w:tc>
-          <w:tcPr>
-            <w:tcW w:type="dxa" w:w="6160"/>
-            <w:tcMar>
-              <w:top w:type="dxa" w:w="90"/>
-              <w:left w:type="dxa" w:w="130"/>
-              <w:bottom w:type="dxa" w:w="90"/>
-              <w:right w:type="dxa" w:w="130"/>
-            </w:tcMar>
-          </w:tcPr>
-          <w:p>
-            <w:pPr>
-              <w:spacing w:after="0" w:line="260"/>
-            </w:pPr>
-            <w:r>
-              <w:rPr>
-                <w:rFonts w:ascii="Calibri" w:cs="Calibri" w:eastAsia="Calibri" w:hAnsi="Calibri"/>
-                <w:color w:val="1A1F1C"/>
-                <w:sz w:val="19"/>
-                <w:szCs w:val="19"/>
-              </w:rPr>
-              <w:t xml:space="preserve">Free text, max 32.</w:t>
-            </w:r>
-          </w:p>
-        </w:tc>
-      </w:tr>
-      <w:tr>
-        <w:tc>
-          <w:tcPr>
-            <w:tcW w:type="dxa" w:w="2200"/>
-            <w:tcMar>
-              <w:top w:type="dxa" w:w="90"/>
-              <w:left w:type="dxa" w:w="130"/>
-              <w:bottom w:type="dxa" w:w="90"/>
-              <w:right w:type="dxa" w:w="130"/>
-            </w:tcMar>
-          </w:tcPr>
-          <w:p>
-            <w:pPr>
-              <w:spacing w:after="0" w:line="260"/>
-            </w:pPr>
-            <w:r>
-              <w:rPr>
-                <w:rFonts w:ascii="Consolas" w:cs="Consolas" w:eastAsia="Consolas" w:hAnsi="Consolas"/>
-                <w:color w:val="2C3530"/>
-                <w:sz w:val="18"/>
-                <w:szCs w:val="18"/>
-              </w:rPr>
               <w:t xml:space="preserve">city</w:t>
             </w:r>
           </w:p>
@@ -1503,7 +1426,7 @@
           <w:sz w:val="20"/>
           <w:szCs w:val="20"/>
         </w:rPr>
-        <w:t xml:space="preserve">Age band, education level and WhatsApp number were dropped from the form and the database. A client still sending them registers successfully — the extra keys are discarded — so an older build of the app keeps working rather than failing at 422.</w:t>
+        <w:t xml:space="preserve">Age band, education level, WhatsApp number and phone were dropped from the registration form. A client still sending them registers successfully — the extra keys are discarded — so an older build of the app keeps working rather than failing at 422. Phone remains on the account screen, so a reader can add one afterwards.</w:t>
       </w:r>
     </w:p>
     <w:p>
@@ -1788,22 +1711,6 @@
           <w:szCs w:val="16"/>
         </w:rPr>
         <w:t xml:space="preserve">    "gender": "male",</w:t>
-      </w:r>
-    </w:p>
-    <w:p>
-      <w:pPr>
-        <w:shd w:fill="F1F4F1" w:val="clear"/>
-        <w:spacing w:after="0" w:before="0" w:line="230"/>
-        <w:ind w:left="140" w:right="140"/>
-      </w:pPr>
-      <w:r>
-        <w:rPr>
-          <w:rFonts w:ascii="Consolas" w:cs="Consolas" w:eastAsia="Consolas" w:hAnsi="Consolas"/>
-          <w:color w:val="2C3530"/>
-          <w:sz w:val="16"/>
-          <w:szCs w:val="16"/>
-        </w:rPr>
-        <w:t xml:space="preserve">    "phone": null,</w:t>
       </w:r>
     </w:p>
     <w:p>

</xml_diff>